<commit_message>
Make the Asia <-> world direction two-way everywhere
Aurora connects Asia with the world and the world with Asia; customers,
brands and creators are worldwide, not Asia-only. Updated the business
plan (summary, audience, opportunity with Asia->World / World->Asia,
why now, products, core customers), Home lede, two program audiences,
and the About, web, launch, Shop and Community plans (direction added
as a fixed brand principle).

Co-Authored-By: Claude Opus 5.5 <noreply@anthropic.com>
Claude-Session: https://claude.ai/code/session_01VLMDQvyzXwonaRACCHVmjk
</commit_message>
<xml_diff>
--- a/auracurate/docs/AuroraCurate_통합웹기획서.docx
+++ b/auracurate/docs/AuroraCurate_통합웹기획서.docx
@@ -806,6 +806,69 @@
                 <w:sz w:val="18"/>
                 <w:szCs w:val="18"/>
               </w:rPr>
+              <w:t xml:space="preserve">방향</w:t>
+            </w:r>
+          </w:p>
+        </w:tc>
+        <w:tc>
+          <w:tcPr>
+            <w:tcW w:type="dxa" w:w="7831"/>
+            <w:tcBorders>
+              <w:top w:val="single" w:color="D9D6E6" w:sz="4"/>
+              <w:left w:val="single" w:color="D9D6E6" w:sz="4"/>
+              <w:bottom w:val="single" w:color="D9D6E6" w:sz="4"/>
+              <w:right w:val="single" w:color="D9D6E6" w:sz="4"/>
+            </w:tcBorders>
+            <w:tcMar>
+              <w:top w:type="dxa" w:w="70"/>
+              <w:left w:type="dxa" w:w="110"/>
+              <w:bottom w:type="dxa" w:w="70"/>
+              <w:right w:type="dxa" w:w="110"/>
+            </w:tcMar>
+            <w:vAlign w:val="top"/>
+          </w:tcPr>
+          <w:p>
+            <w:pPr>
+              <w:spacing w:after="40" w:line="260"/>
+            </w:pPr>
+            <w:r>
+              <w:rPr>
+                <w:sz w:val="18"/>
+                <w:szCs w:val="18"/>
+              </w:rPr>
+              <w:t xml:space="preserve">Asia → World, World → Asia — 아시아를 세계로, 세계를 아시아로. 고객·브랜드·크리에이터는 전 세계 (아시아 한정 아님)</w:t>
+            </w:r>
+          </w:p>
+        </w:tc>
+      </w:tr>
+      <w:tr>
+        <w:tc>
+          <w:tcPr>
+            <w:tcW w:type="dxa" w:w="1807"/>
+            <w:tcBorders>
+              <w:top w:val="single" w:color="D9D6E6" w:sz="4"/>
+              <w:left w:val="single" w:color="D9D6E6" w:sz="4"/>
+              <w:bottom w:val="single" w:color="D9D6E6" w:sz="4"/>
+              <w:right w:val="single" w:color="D9D6E6" w:sz="4"/>
+            </w:tcBorders>
+            <w:shd w:fill="FBFAFD" w:color="auto" w:val="clear"/>
+            <w:tcMar>
+              <w:top w:type="dxa" w:w="70"/>
+              <w:left w:type="dxa" w:w="110"/>
+              <w:bottom w:type="dxa" w:w="70"/>
+              <w:right w:type="dxa" w:w="110"/>
+            </w:tcMar>
+            <w:vAlign w:val="top"/>
+          </w:tcPr>
+          <w:p>
+            <w:pPr>
+              <w:spacing w:after="40" w:line="260"/>
+            </w:pPr>
+            <w:r>
+              <w:rPr>
+                <w:sz w:val="18"/>
+                <w:szCs w:val="18"/>
+              </w:rPr>
               <w:t xml:space="preserve">쉬운 말</w:t>
             </w:r>
           </w:p>
@@ -836,7 +899,7 @@
                 <w:sz w:val="18"/>
                 <w:szCs w:val="18"/>
               </w:rPr>
-              <w:t xml:space="preserve">Aurora는 아시아와 세계의 멋진 사람·아이디어·브랜드를 찾아서, 그 이야기를 읽고, 그 사람을 만나고, 함께 참여하고, 마음에 드는 것을 가져갈 수 있게 해 주는 곳입니다.</w:t>
+              <w:t xml:space="preserve">Aurora는 전 세계의 멋진 사람·아이디어·브랜드를 찾아 아시아는 세계로, 세계는 아시아로 이어 주고, 그 이야기를 읽고, 그 사람을 만나고, 함께 참여하고, 마음에 드는 것을 가져갈 수 있게 해 주는 곳입니다.</w:t>
             </w:r>
           </w:p>
         </w:tc>
@@ -15111,7 +15174,7 @@
       <w:pPr>
         <w:spacing w:after="160"/>
       </w:pPr>
-      <w:hyperlink w:history="1" r:id="rId9mipabbgf094ry6kuzvsy">
+      <w:hyperlink w:history="1" r:id="rIdoqgaaaeflwzxjlowr7wqr">
         <w:r>
           <w:rPr>
             <w:rStyle w:val="Hyperlink"/>

</xml_diff>